<commit_message>
docs: convention NORMATYS-IRICE sur OpenNAT numérotée 007 (006 déjà employée) ; note licence et livraison du lot 7 mises à jour
</commit_message>
<xml_diff>
--- a/livraison/OpenNAT, droits, licences et conventions NORMATYS-IRICE.docx
+++ b/livraison/OpenNAT, droits, licences et conventions NORMATYS-IRICE.docx
@@ -914,7 +914,7 @@
           <w:rFonts w:ascii="Calibri" w:hAnsi="Calibri"/>
           <w:sz w:val="20"/>
         </w:rPr>
-        <w:t>Retenir le montage A et le fixer par une convention dédiée, NTY-CNV-2026-006, plutôt que par un avenant à la convention Effinature : OpenNAT est une méthode distincte, appelée à servir Effinature mais aussi d'autres usages (permis de construire, comparaison de variantes), et la convention Effinature restera lisible. La convention 006 :</w:t>
+        <w:t>Retenir le montage A et le fixer par une convention dédiée, NTY-CNV-2026-007 (la référence 006 a servi à un avenant préparé le 11 octobre puis abandonné), plutôt que par un avenant à la convention Effinature : OpenNAT est une méthode distincte, appelée à servir Effinature mais aussi d'autres usages (permis de construire, comparaison de variantes), et la convention Effinature restera lisible. La convention 007 :</w:t>
       </w:r>
     </w:p>
     <w:p>
@@ -1036,7 +1036,7 @@
           <w:rFonts w:ascii="Poppins" w:hAnsi="Poppins" w:cs="Poppins" w:eastAsia="Poppins"/>
           <w:color w:val="1A4F9C"/>
         </w:rPr>
-        <w:t>Annexe. Projet de clauses de la convention NTY-CNV-2026-006</w:t>
+        <w:t>Annexe. Projet de clauses de la convention NTY-CNV-2026-007</w:t>
       </w:r>
     </w:p>
     <w:p>

</xml_diff>